<commit_message>
Gravity, Actually: apply the new all-books heading rule
Heading 1 style set to centered, 16pt (was already bold, dark-blue
Georgia). Page size changed from US Letter to 6in x 9in with 0.7in/0.6in
margins. Verified zip integrity and unchanged paragraph count (1338)
before replacing the tracked docx.

Co-Authored-By: Claude Sonnet 5 <noreply@anthropic.com>
Claude-Session: https://claude.ai/code/session_01No3CTqqXoAC7DqUj3kRTnA
</commit_message>
<xml_diff>
--- a/Gravity, Actually/Gravity, Actually - Rev10.docx
+++ b/Gravity, Actually/Gravity, Actually - Rev10.docx
@@ -18353,8 +18353,8 @@
     </w:p>
     <w:sectPr>
       <w:headerReference w:type="default" r:id="rId9"/>
-      <w:pgSz w:w="12240" w:h="15840"/>
-      <w:pgMar w:top="1440" w:right="1440" w:bottom="1440" w:left="1440" w:header="720" w:footer="720" w:gutter="0"/>
+      <w:pgSz w:w="8640" w:h="12960"/>
+      <w:pgMar w:top="864" w:right="1008" w:bottom="864" w:left="1008" w:header="720" w:footer="720" w:gutter="0"/>
       <w:cols w:space="720"/>
       <w:docGrid w:linePitch="360"/>
     </w:sectPr>
@@ -18807,6 +18807,7 @@
       <w:keepNext/>
       <w:keepLines/>
       <w:spacing w:before="0" w:after="280"/>
+      <w:jc w:val="center"/>
       <w:outlineLvl w:val="0"/>
     </w:pPr>
     <w:rPr>
@@ -18814,7 +18815,7 @@
       <w:b/>
       <w:bCs/>
       <w:color w:val="1F3A5F"/>
-      <w:sz w:val="40"/>
+      <w:sz w:val="32"/>
       <w:szCs w:val="28"/>
     </w:rPr>
   </w:style>

</xml_diff>